<commit_message>
vaxtrack: final closure for v2.0, for open gaps wait for v2.1
</commit_message>
<xml_diff>
--- a/Documents/v2_docs/vaxtrack - support documents/05-Deployment-Runbook.docx
+++ b/Documents/v2_docs/vaxtrack - support documents/05-Deployment-Runbook.docx
@@ -4838,6 +4838,33 @@
     </w:p>
     <w:p>
       <w:pPr>
+        <w:pStyle w:val="ListParagraph"/>
+        <w:numPr>
+          <w:ilvl w:val="0"/>
+          <w:numId w:val="1"/>
+        </w:numPr>
+        <w:spacing w:after="120" w:line="336" w:lineRule="auto"/>
+      </w:pPr>
+      <w:r>
+        <w:rPr>
+          <w:rFonts w:ascii="Arial" w:hAnsi="Arial"/>
+          <w:b/>
+          <w:color w:val="222222"/>
+          <w:sz w:val="22"/>
+        </w:rPr>
+        <w:t xml:space="preserve">Response security headers: </w:t>
+      </w:r>
+      <w:r>
+        <w:rPr>
+          <w:rFonts w:ascii="Arial" w:hAnsi="Arial"/>
+          <w:color w:val="333333"/>
+          <w:sz w:val="22"/>
+        </w:rPr>
+        <w:t>no hardening headers (Content-Security-Policy, X-Content-Type-Options, X-Frame-Options, Referrer-Policy, Strict-Transport-Security) are set on either service today — only CORS and the static-file no-cache header are configured. This is an open item pending implementation, not a cost blocker: unlike Azure API Management/WAF (Section 11), these headers can be added for free via backend middleware and the frontend's staticwebapp.config.json globalHeaders block; see Section 11 for the fix path and the actual blocker.</w:t>
+      </w:r>
+    </w:p>
+    <w:p>
+      <w:pPr>
         <w:pStyle w:val="Heading1"/>
         <w:pBdr>
           <w:bottom w:val="single" w:color="BA7517" w:sz="6" w:space="4"/>
@@ -5652,6 +5679,33 @@
           <w:szCs w:val="22"/>
         </w:rPr>
         <w:t xml:space="preserve">Yes to security value, but APIM and Front Door/WAF do not have a perpetual free tier suitable for this setup — adding either would break the zero-cost constraint. The free-tier-compatible hardening already in place is: a configuration-driven CORS allow-list instead of AllowAnyOrigin, short-lived JWTs, HTTPS enforced by default on both App Service and Static Web Apps, and no secrets in source control. Anything beyond that (rate limiting, IP allow-listing, a managed API gateway) would need a paid tier and was deliberately not pursued here.</w:t>
+      </w:r>
+    </w:p>
+    <w:p>
+      <w:pPr>
+        <w:spacing w:after="60" w:before="200"/>
+      </w:pPr>
+      <w:r>
+        <w:rPr>
+          <w:rFonts w:ascii="Arial" w:hAnsi="Arial"/>
+          <w:b/>
+          <w:color w:val="222222"/>
+          <w:sz w:val="22"/>
+        </w:rPr>
+        <w:t>Are the missing response security headers (CSP, X-Frame-Options, HSTS, etc.) blocked by the same free-tier cost issue as APIM/WAF?</w:t>
+      </w:r>
+    </w:p>
+    <w:p>
+      <w:pPr>
+        <w:spacing w:after="160" w:line="336" w:lineRule="auto"/>
+      </w:pPr>
+      <w:r>
+        <w:rPr>
+          <w:rFonts w:ascii="Arial" w:hAnsi="Arial"/>
+          <w:color w:val="333333"/>
+          <w:sz w:val="22"/>
+        </w:rPr>
+        <w:t>No — that's a separate, free gap that simply hasn't been implemented yet, and it shouldn't be lumped in with the APIM/WAF cost question above. Response headers are set in application code, not by a paid gateway: a small ASP.NET Core middleware block can add Strict-Transport-Security, X-Content-Type-Options, X-Frame-Options, and Referrer-Policy on the backend, and Azure Static Web Apps supports the same for the frontend via a globalHeaders block in staticwebapp.config.json — both fit inside the existing free tier. The real blocker is scoped dev/test effort, not billing: a Content-Security-Policy directive set needs to be worked out and tested against the Angular build's actual script/style/font sources so it hardens the app without breaking it. Tracked as an open item in Section 9.</w:t>
       </w:r>
     </w:p>
     <w:p>

</xml_diff>